<commit_message>
complete DAC P4 finalization gate
</commit_message>
<xml_diff>
--- a/paper_draft/dac2027_contract_guided_comsol_submission.docx
+++ b/paper_draft/dac2027_contract_guided_comsol_submission.docx
@@ -467,6 +467,9 @@
         <w:gridCol w:w="3437"/>
       </w:tblGrid>
       <w:tr>
+        <w:trPr>
+          <w:cantSplit/>
+        </w:trPr>
         <w:tc>
           <w:tcPr>
             <w:tcW w:type="dxa" w:w="1296"/>
@@ -481,6 +484,7 @@
           </w:tcPr>
           <w:p>
             <w:pPr>
+              <w:keepNext/>
               <w:spacing w:after="0"/>
               <w:jc w:val="center"/>
             </w:pPr>
@@ -510,6 +514,7 @@
           </w:tcPr>
           <w:p>
             <w:pPr>
+              <w:keepNext/>
               <w:spacing w:after="0"/>
               <w:jc w:val="center"/>
             </w:pPr>
@@ -539,6 +544,7 @@
           </w:tcPr>
           <w:p>
             <w:pPr>
+              <w:keepNext/>
               <w:spacing w:after="0"/>
               <w:jc w:val="center"/>
             </w:pPr>
@@ -556,6 +562,9 @@
         </w:tc>
       </w:tr>
       <w:tr>
+        <w:trPr>
+          <w:cantSplit/>
+        </w:trPr>
         <w:tc>
           <w:tcPr>
             <w:tcW w:type="dxa" w:w="1296"/>
@@ -569,6 +578,7 @@
           </w:tcPr>
           <w:p>
             <w:pPr>
+              <w:keepNext/>
               <w:spacing w:after="0" w:line="216" w:lineRule="auto"/>
               <w:jc w:val="left"/>
             </w:pPr>
@@ -597,6 +607,7 @@
           </w:tcPr>
           <w:p>
             <w:pPr>
+              <w:keepNext/>
               <w:spacing w:after="0" w:line="216" w:lineRule="auto"/>
               <w:jc w:val="left"/>
             </w:pPr>
@@ -625,6 +636,7 @@
           </w:tcPr>
           <w:p>
             <w:pPr>
+              <w:keepNext/>
               <w:spacing w:after="0" w:line="216" w:lineRule="auto"/>
               <w:jc w:val="left"/>
             </w:pPr>
@@ -642,6 +654,9 @@
         </w:tc>
       </w:tr>
       <w:tr>
+        <w:trPr>
+          <w:cantSplit/>
+        </w:trPr>
         <w:tc>
           <w:tcPr>
             <w:tcW w:type="dxa" w:w="1296"/>
@@ -656,6 +671,7 @@
           </w:tcPr>
           <w:p>
             <w:pPr>
+              <w:keepNext/>
               <w:spacing w:after="0" w:line="216" w:lineRule="auto"/>
               <w:jc w:val="left"/>
             </w:pPr>
@@ -685,6 +701,7 @@
           </w:tcPr>
           <w:p>
             <w:pPr>
+              <w:keepNext/>
               <w:spacing w:after="0" w:line="216" w:lineRule="auto"/>
               <w:jc w:val="left"/>
             </w:pPr>
@@ -714,6 +731,7 @@
           </w:tcPr>
           <w:p>
             <w:pPr>
+              <w:keepNext/>
               <w:spacing w:after="0" w:line="216" w:lineRule="auto"/>
               <w:jc w:val="left"/>
             </w:pPr>
@@ -731,6 +749,9 @@
         </w:tc>
       </w:tr>
       <w:tr>
+        <w:trPr>
+          <w:cantSplit/>
+        </w:trPr>
         <w:tc>
           <w:tcPr>
             <w:tcW w:type="dxa" w:w="1296"/>
@@ -744,6 +765,7 @@
           </w:tcPr>
           <w:p>
             <w:pPr>
+              <w:keepNext/>
               <w:spacing w:after="0" w:line="216" w:lineRule="auto"/>
               <w:jc w:val="left"/>
             </w:pPr>
@@ -772,6 +794,7 @@
           </w:tcPr>
           <w:p>
             <w:pPr>
+              <w:keepNext/>
               <w:spacing w:after="0" w:line="216" w:lineRule="auto"/>
               <w:jc w:val="left"/>
             </w:pPr>
@@ -800,6 +823,7 @@
           </w:tcPr>
           <w:p>
             <w:pPr>
+              <w:keepNext/>
               <w:spacing w:after="0" w:line="216" w:lineRule="auto"/>
               <w:jc w:val="left"/>
             </w:pPr>
@@ -817,6 +841,9 @@
         </w:tc>
       </w:tr>
       <w:tr>
+        <w:trPr>
+          <w:cantSplit/>
+        </w:trPr>
         <w:tc>
           <w:tcPr>
             <w:tcW w:type="dxa" w:w="1296"/>
@@ -831,6 +858,7 @@
           </w:tcPr>
           <w:p>
             <w:pPr>
+              <w:keepNext/>
               <w:spacing w:after="0" w:line="216" w:lineRule="auto"/>
               <w:jc w:val="left"/>
             </w:pPr>
@@ -860,6 +888,7 @@
           </w:tcPr>
           <w:p>
             <w:pPr>
+              <w:keepNext/>
               <w:spacing w:after="0" w:line="216" w:lineRule="auto"/>
               <w:jc w:val="left"/>
             </w:pPr>
@@ -889,6 +918,7 @@
           </w:tcPr>
           <w:p>
             <w:pPr>
+              <w:keepNext/>
               <w:spacing w:after="0" w:line="216" w:lineRule="auto"/>
               <w:jc w:val="left"/>
             </w:pPr>
@@ -906,6 +936,9 @@
         </w:tc>
       </w:tr>
       <w:tr>
+        <w:trPr>
+          <w:cantSplit/>
+        </w:trPr>
         <w:tc>
           <w:tcPr>
             <w:tcW w:type="dxa" w:w="1296"/>
@@ -919,6 +952,7 @@
           </w:tcPr>
           <w:p>
             <w:pPr>
+              <w:keepNext w:val="0"/>
               <w:spacing w:after="0" w:line="216" w:lineRule="auto"/>
               <w:jc w:val="left"/>
             </w:pPr>
@@ -947,6 +981,7 @@
           </w:tcPr>
           <w:p>
             <w:pPr>
+              <w:keepNext w:val="0"/>
               <w:spacing w:after="0" w:line="216" w:lineRule="auto"/>
               <w:jc w:val="left"/>
             </w:pPr>
@@ -975,6 +1010,7 @@
           </w:tcPr>
           <w:p>
             <w:pPr>
+              <w:keepNext w:val="0"/>
               <w:spacing w:after="0" w:line="216" w:lineRule="auto"/>
               <w:jc w:val="left"/>
             </w:pPr>
@@ -1182,6 +1218,9 @@
         <w:gridCol w:w="3437"/>
       </w:tblGrid>
       <w:tr>
+        <w:trPr>
+          <w:cantSplit/>
+        </w:trPr>
         <w:tc>
           <w:tcPr>
             <w:tcW w:type="dxa" w:w="1267"/>
@@ -1196,6 +1235,7 @@
           </w:tcPr>
           <w:p>
             <w:pPr>
+              <w:keepNext/>
               <w:spacing w:after="0"/>
               <w:jc w:val="center"/>
             </w:pPr>
@@ -1225,6 +1265,7 @@
           </w:tcPr>
           <w:p>
             <w:pPr>
+              <w:keepNext/>
               <w:spacing w:after="0"/>
               <w:jc w:val="center"/>
             </w:pPr>
@@ -1254,6 +1295,7 @@
           </w:tcPr>
           <w:p>
             <w:pPr>
+              <w:keepNext/>
               <w:spacing w:after="0"/>
               <w:jc w:val="center"/>
             </w:pPr>
@@ -1271,6 +1313,9 @@
         </w:tc>
       </w:tr>
       <w:tr>
+        <w:trPr>
+          <w:cantSplit/>
+        </w:trPr>
         <w:tc>
           <w:tcPr>
             <w:tcW w:type="dxa" w:w="1267"/>
@@ -1284,6 +1329,7 @@
           </w:tcPr>
           <w:p>
             <w:pPr>
+              <w:keepNext/>
               <w:spacing w:after="0" w:line="216" w:lineRule="auto"/>
               <w:jc w:val="left"/>
             </w:pPr>
@@ -1312,6 +1358,7 @@
           </w:tcPr>
           <w:p>
             <w:pPr>
+              <w:keepNext/>
               <w:spacing w:after="0" w:line="216" w:lineRule="auto"/>
               <w:jc w:val="left"/>
             </w:pPr>
@@ -1340,6 +1387,7 @@
           </w:tcPr>
           <w:p>
             <w:pPr>
+              <w:keepNext/>
               <w:spacing w:after="0" w:line="216" w:lineRule="auto"/>
               <w:jc w:val="left"/>
             </w:pPr>
@@ -1357,6 +1405,9 @@
         </w:tc>
       </w:tr>
       <w:tr>
+        <w:trPr>
+          <w:cantSplit/>
+        </w:trPr>
         <w:tc>
           <w:tcPr>
             <w:tcW w:type="dxa" w:w="1267"/>
@@ -1371,6 +1422,7 @@
           </w:tcPr>
           <w:p>
             <w:pPr>
+              <w:keepNext w:val="0"/>
               <w:spacing w:after="0" w:line="216" w:lineRule="auto"/>
               <w:jc w:val="left"/>
             </w:pPr>
@@ -1400,6 +1452,7 @@
           </w:tcPr>
           <w:p>
             <w:pPr>
+              <w:keepNext w:val="0"/>
               <w:spacing w:after="0" w:line="216" w:lineRule="auto"/>
               <w:jc w:val="left"/>
             </w:pPr>
@@ -1429,6 +1482,7 @@
           </w:tcPr>
           <w:p>
             <w:pPr>
+              <w:keepNext w:val="0"/>
               <w:spacing w:after="0" w:line="216" w:lineRule="auto"/>
               <w:jc w:val="left"/>
             </w:pPr>
@@ -1603,6 +1657,9 @@
         <w:gridCol w:w="2577"/>
       </w:tblGrid>
       <w:tr>
+        <w:trPr>
+          <w:cantSplit/>
+        </w:trPr>
         <w:tc>
           <w:tcPr>
             <w:tcW w:type="dxa" w:w="1296"/>
@@ -1617,6 +1674,7 @@
           </w:tcPr>
           <w:p>
             <w:pPr>
+              <w:keepNext/>
               <w:spacing w:after="0"/>
               <w:jc w:val="center"/>
             </w:pPr>
@@ -1646,6 +1704,7 @@
           </w:tcPr>
           <w:p>
             <w:pPr>
+              <w:keepNext/>
               <w:spacing w:after="0"/>
               <w:jc w:val="center"/>
             </w:pPr>
@@ -1675,6 +1734,7 @@
           </w:tcPr>
           <w:p>
             <w:pPr>
+              <w:keepNext/>
               <w:spacing w:after="0"/>
               <w:jc w:val="center"/>
             </w:pPr>
@@ -1704,6 +1764,7 @@
           </w:tcPr>
           <w:p>
             <w:pPr>
+              <w:keepNext/>
               <w:spacing w:after="0"/>
               <w:jc w:val="center"/>
             </w:pPr>
@@ -1721,6 +1782,9 @@
         </w:tc>
       </w:tr>
       <w:tr>
+        <w:trPr>
+          <w:cantSplit/>
+        </w:trPr>
         <w:tc>
           <w:tcPr>
             <w:tcW w:type="dxa" w:w="1296"/>
@@ -1734,6 +1798,7 @@
           </w:tcPr>
           <w:p>
             <w:pPr>
+              <w:keepNext/>
               <w:spacing w:after="0" w:line="216" w:lineRule="auto"/>
               <w:jc w:val="left"/>
             </w:pPr>
@@ -1762,6 +1827,7 @@
           </w:tcPr>
           <w:p>
             <w:pPr>
+              <w:keepNext/>
               <w:spacing w:after="0" w:line="216" w:lineRule="auto"/>
               <w:jc w:val="left"/>
             </w:pPr>
@@ -1790,6 +1856,7 @@
           </w:tcPr>
           <w:p>
             <w:pPr>
+              <w:keepNext/>
               <w:spacing w:after="0" w:line="216" w:lineRule="auto"/>
               <w:jc w:val="left"/>
             </w:pPr>
@@ -1818,6 +1885,7 @@
           </w:tcPr>
           <w:p>
             <w:pPr>
+              <w:keepNext/>
               <w:spacing w:after="0" w:line="216" w:lineRule="auto"/>
               <w:jc w:val="left"/>
             </w:pPr>
@@ -1835,6 +1903,9 @@
         </w:tc>
       </w:tr>
       <w:tr>
+        <w:trPr>
+          <w:cantSplit/>
+        </w:trPr>
         <w:tc>
           <w:tcPr>
             <w:tcW w:type="dxa" w:w="1296"/>
@@ -1849,6 +1920,7 @@
           </w:tcPr>
           <w:p>
             <w:pPr>
+              <w:keepNext/>
               <w:spacing w:after="0" w:line="216" w:lineRule="auto"/>
               <w:jc w:val="left"/>
             </w:pPr>
@@ -1878,6 +1950,7 @@
           </w:tcPr>
           <w:p>
             <w:pPr>
+              <w:keepNext/>
               <w:spacing w:after="0" w:line="216" w:lineRule="auto"/>
               <w:jc w:val="left"/>
             </w:pPr>
@@ -1907,6 +1980,7 @@
           </w:tcPr>
           <w:p>
             <w:pPr>
+              <w:keepNext/>
               <w:spacing w:after="0" w:line="216" w:lineRule="auto"/>
               <w:jc w:val="left"/>
             </w:pPr>
@@ -1936,6 +2010,7 @@
           </w:tcPr>
           <w:p>
             <w:pPr>
+              <w:keepNext/>
               <w:spacing w:after="0" w:line="216" w:lineRule="auto"/>
               <w:jc w:val="left"/>
             </w:pPr>
@@ -1953,6 +2028,9 @@
         </w:tc>
       </w:tr>
       <w:tr>
+        <w:trPr>
+          <w:cantSplit/>
+        </w:trPr>
         <w:tc>
           <w:tcPr>
             <w:tcW w:type="dxa" w:w="1296"/>
@@ -1966,6 +2044,7 @@
           </w:tcPr>
           <w:p>
             <w:pPr>
+              <w:keepNext/>
               <w:spacing w:after="0" w:line="216" w:lineRule="auto"/>
               <w:jc w:val="left"/>
             </w:pPr>
@@ -1994,6 +2073,7 @@
           </w:tcPr>
           <w:p>
             <w:pPr>
+              <w:keepNext/>
               <w:spacing w:after="0" w:line="216" w:lineRule="auto"/>
               <w:jc w:val="left"/>
             </w:pPr>
@@ -2022,6 +2102,7 @@
           </w:tcPr>
           <w:p>
             <w:pPr>
+              <w:keepNext/>
               <w:spacing w:after="0" w:line="216" w:lineRule="auto"/>
               <w:jc w:val="left"/>
             </w:pPr>
@@ -2050,6 +2131,7 @@
           </w:tcPr>
           <w:p>
             <w:pPr>
+              <w:keepNext/>
               <w:spacing w:after="0" w:line="216" w:lineRule="auto"/>
               <w:jc w:val="left"/>
             </w:pPr>
@@ -2067,6 +2149,9 @@
         </w:tc>
       </w:tr>
       <w:tr>
+        <w:trPr>
+          <w:cantSplit/>
+        </w:trPr>
         <w:tc>
           <w:tcPr>
             <w:tcW w:type="dxa" w:w="1296"/>
@@ -2081,6 +2166,7 @@
           </w:tcPr>
           <w:p>
             <w:pPr>
+              <w:keepNext w:val="0"/>
               <w:spacing w:after="0" w:line="216" w:lineRule="auto"/>
               <w:jc w:val="left"/>
             </w:pPr>
@@ -2110,6 +2196,7 @@
           </w:tcPr>
           <w:p>
             <w:pPr>
+              <w:keepNext w:val="0"/>
               <w:spacing w:after="0" w:line="216" w:lineRule="auto"/>
               <w:jc w:val="left"/>
             </w:pPr>
@@ -2139,6 +2226,7 @@
           </w:tcPr>
           <w:p>
             <w:pPr>
+              <w:keepNext w:val="0"/>
               <w:spacing w:after="0" w:line="216" w:lineRule="auto"/>
               <w:jc w:val="left"/>
             </w:pPr>
@@ -2168,6 +2256,7 @@
           </w:tcPr>
           <w:p>
             <w:pPr>
+              <w:keepNext w:val="0"/>
               <w:spacing w:after="0" w:line="216" w:lineRule="auto"/>
               <w:jc w:val="left"/>
             </w:pPr>
@@ -2427,6 +2516,9 @@
         <w:gridCol w:w="3437"/>
       </w:tblGrid>
       <w:tr>
+        <w:trPr>
+          <w:cantSplit/>
+        </w:trPr>
         <w:tc>
           <w:tcPr>
             <w:tcW w:type="dxa" w:w="1195"/>
@@ -2441,6 +2533,7 @@
           </w:tcPr>
           <w:p>
             <w:pPr>
+              <w:keepNext/>
               <w:spacing w:after="0"/>
               <w:jc w:val="center"/>
             </w:pPr>
@@ -2470,6 +2563,7 @@
           </w:tcPr>
           <w:p>
             <w:pPr>
+              <w:keepNext/>
               <w:spacing w:after="0"/>
               <w:jc w:val="center"/>
             </w:pPr>
@@ -2499,6 +2593,7 @@
           </w:tcPr>
           <w:p>
             <w:pPr>
+              <w:keepNext/>
               <w:spacing w:after="0"/>
               <w:jc w:val="center"/>
             </w:pPr>
@@ -2516,6 +2611,9 @@
         </w:tc>
       </w:tr>
       <w:tr>
+        <w:trPr>
+          <w:cantSplit/>
+        </w:trPr>
         <w:tc>
           <w:tcPr>
             <w:tcW w:type="dxa" w:w="1195"/>
@@ -2529,6 +2627,7 @@
           </w:tcPr>
           <w:p>
             <w:pPr>
+              <w:keepNext/>
               <w:spacing w:after="0" w:line="216" w:lineRule="auto"/>
               <w:jc w:val="left"/>
             </w:pPr>
@@ -2557,6 +2656,7 @@
           </w:tcPr>
           <w:p>
             <w:pPr>
+              <w:keepNext/>
               <w:spacing w:after="0" w:line="216" w:lineRule="auto"/>
               <w:jc w:val="left"/>
             </w:pPr>
@@ -2585,6 +2685,7 @@
           </w:tcPr>
           <w:p>
             <w:pPr>
+              <w:keepNext/>
               <w:spacing w:after="0" w:line="216" w:lineRule="auto"/>
               <w:jc w:val="left"/>
             </w:pPr>
@@ -2602,6 +2703,9 @@
         </w:tc>
       </w:tr>
       <w:tr>
+        <w:trPr>
+          <w:cantSplit/>
+        </w:trPr>
         <w:tc>
           <w:tcPr>
             <w:tcW w:type="dxa" w:w="1195"/>
@@ -2616,6 +2720,7 @@
           </w:tcPr>
           <w:p>
             <w:pPr>
+              <w:keepNext/>
               <w:spacing w:after="0" w:line="216" w:lineRule="auto"/>
               <w:jc w:val="left"/>
             </w:pPr>
@@ -2645,6 +2750,7 @@
           </w:tcPr>
           <w:p>
             <w:pPr>
+              <w:keepNext/>
               <w:spacing w:after="0" w:line="216" w:lineRule="auto"/>
               <w:jc w:val="left"/>
             </w:pPr>
@@ -2674,6 +2780,7 @@
           </w:tcPr>
           <w:p>
             <w:pPr>
+              <w:keepNext/>
               <w:spacing w:after="0" w:line="216" w:lineRule="auto"/>
               <w:jc w:val="left"/>
             </w:pPr>
@@ -2691,6 +2798,9 @@
         </w:tc>
       </w:tr>
       <w:tr>
+        <w:trPr>
+          <w:cantSplit/>
+        </w:trPr>
         <w:tc>
           <w:tcPr>
             <w:tcW w:type="dxa" w:w="1195"/>
@@ -2704,6 +2814,7 @@
           </w:tcPr>
           <w:p>
             <w:pPr>
+              <w:keepNext/>
               <w:spacing w:after="0" w:line="216" w:lineRule="auto"/>
               <w:jc w:val="left"/>
             </w:pPr>
@@ -2732,6 +2843,7 @@
           </w:tcPr>
           <w:p>
             <w:pPr>
+              <w:keepNext/>
               <w:spacing w:after="0" w:line="216" w:lineRule="auto"/>
               <w:jc w:val="left"/>
             </w:pPr>
@@ -2760,6 +2872,7 @@
           </w:tcPr>
           <w:p>
             <w:pPr>
+              <w:keepNext/>
               <w:spacing w:after="0" w:line="216" w:lineRule="auto"/>
               <w:jc w:val="left"/>
             </w:pPr>
@@ -2777,6 +2890,9 @@
         </w:tc>
       </w:tr>
       <w:tr>
+        <w:trPr>
+          <w:cantSplit/>
+        </w:trPr>
         <w:tc>
           <w:tcPr>
             <w:tcW w:type="dxa" w:w="1195"/>
@@ -2791,6 +2907,7 @@
           </w:tcPr>
           <w:p>
             <w:pPr>
+              <w:keepNext/>
               <w:spacing w:after="0" w:line="216" w:lineRule="auto"/>
               <w:jc w:val="left"/>
             </w:pPr>
@@ -2820,6 +2937,7 @@
           </w:tcPr>
           <w:p>
             <w:pPr>
+              <w:keepNext/>
               <w:spacing w:after="0" w:line="216" w:lineRule="auto"/>
               <w:jc w:val="left"/>
             </w:pPr>
@@ -2849,6 +2967,7 @@
           </w:tcPr>
           <w:p>
             <w:pPr>
+              <w:keepNext/>
               <w:spacing w:after="0" w:line="216" w:lineRule="auto"/>
               <w:jc w:val="left"/>
             </w:pPr>
@@ -2866,6 +2985,9 @@
         </w:tc>
       </w:tr>
       <w:tr>
+        <w:trPr>
+          <w:cantSplit/>
+        </w:trPr>
         <w:tc>
           <w:tcPr>
             <w:tcW w:type="dxa" w:w="1195"/>
@@ -2879,6 +3001,7 @@
           </w:tcPr>
           <w:p>
             <w:pPr>
+              <w:keepNext w:val="0"/>
               <w:spacing w:after="0" w:line="216" w:lineRule="auto"/>
               <w:jc w:val="left"/>
             </w:pPr>
@@ -2907,6 +3030,7 @@
           </w:tcPr>
           <w:p>
             <w:pPr>
+              <w:keepNext w:val="0"/>
               <w:spacing w:after="0" w:line="216" w:lineRule="auto"/>
               <w:jc w:val="left"/>
             </w:pPr>
@@ -2935,6 +3059,7 @@
           </w:tcPr>
           <w:p>
             <w:pPr>
+              <w:keepNext w:val="0"/>
               <w:spacing w:after="0" w:line="216" w:lineRule="auto"/>
               <w:jc w:val="left"/>
             </w:pPr>

</xml_diff>